<commit_message>
Update LAB2_2 shop database
</commit_message>
<xml_diff>
--- a/Programming/LAB2_2/Report.docx
+++ b/Programming/LAB2_2/Report.docx
@@ -1219,10 +1219,18 @@
         </w:rPr>
       </w:pPr>
       <w:r>
+        <w:t>The program is based on the structure Shop, which stores shop title, address, and telephone number in fixed-size character arrays. All records are processed in the native array Shop shops[MAX_SHOPS].</w:t>
+      </w:r>
+    </w:p>
+    <w:p>
+      <w:pPr>
+        <w:jc w:val="left"/>
         <w:rPr>
           <w:rFonts w:cs="Times New Roman"/>
         </w:rPr>
-        <w:t>The program is based on the structure s_shop, which stores shop title, address, and telephone number in character arrays. The data are saved in the text file shops.txt, where one record is stored in one line and fields are separated with the character |.</w:t>
+      </w:pPr>
+      <w:r>
+        <w:t>The file shops.dat is used for binary storage. The program writes the number of saved shops first and then writes the array of Shop records. When data are loaded, readShops opens the file in binary mode, reads the count, checks that it is within the allowed range, and then reads the records into the native array.</w:t>
       </w:r>
     </w:p>
     <w:p>
@@ -1233,30 +1241,7 @@
         </w:rPr>
       </w:pPr>
       <w:r>
-        <w:rPr>
-          <w:rFonts w:cs="Times New Roman"/>
-        </w:rPr>
-        <w:t xml:space="preserve">Menu processing is implemented in main. The program prints the individual task number and then repeatedly shows menu items for viewing data, adding data, performing the individual task, and exiting the application. </w:t>
-      </w:r>
-      <w:r>
-        <w:rPr>
-          <w:rFonts w:cs="Times New Roman"/>
-        </w:rPr>
-        <w:t>Input is read with fgets so spaces in titles and addresses are handled correctly.</w:t>
-      </w:r>
-    </w:p>
-    <w:p>
-      <w:pPr>
-        <w:jc w:val="left"/>
-        <w:rPr>
-          <w:rFonts w:cs="Times New Roman"/>
-        </w:rPr>
-      </w:pPr>
-      <w:r>
-        <w:rPr>
-          <w:rFonts w:cs="Times New Roman"/>
-        </w:rPr>
-        <w:t>When a new record is entered, the function add_data reads the three fields, checks that the separator character is not used inside the data, and appends the record to the file. The function view_data loads all existing file records into a native array of structures and prints them with numbering.</w:t>
+        <w:t>Menu processing is implemented in main. The program prints the individual task number 93642 % 20 and then repeatedly shows four menu items: add data, view data, define tel. number by address, and exit. cin and getline are used so titles, addresses, and telephone numbers may contain spaces.</w:t>
       </w:r>
     </w:p>
     <w:p>
@@ -1272,14 +1257,7 @@
         </w:rPr>
       </w:pPr>
       <w:r>
-        <w:rPr>
-          <w:rFonts w:eastAsiaTheme="minorHAnsi" w:cs="Times New Roman"/>
-          <w:b w:val="0"/>
-          <w:caps w:val="0"/>
-          <w:sz w:val="24"/>
-          <w:szCs w:val="22"/>
-        </w:rPr>
-        <w:t>The individual task is implemented in the function individual_task. It loads file data into an array, asks the user for an address, and then sequentially compares the entered address with each structure field using strcmp. If a matching address is found, the corresponding telephone number is printed. If the file is empty or no matching address exists, the program prints an explanatory message.</w:t>
+        <w:t>When a new shop is entered, addData loads existing records, checks that the array is not full, saves the new data into the next array element, increases the count, and rewrites shops.dat in binary form. viewData loads the same binary file and prints each record clearly with numbering. The individual operation definePhoneByAddress loads the records, asks for an address, compares it with each stored address using strcmp, and prints the matching telephone number or an explanatory message.</w:t>
       </w:r>
     </w:p>
     <w:p>
@@ -7895,17 +7873,7 @@
             <w:shd w:val="clear" w:color="auto" w:fill="auto"/>
           </w:tcPr>
           <w:p>
-            <w:pPr>
-              <w:ind w:firstLine="0"/>
-              <w:jc w:val="center"/>
-              <w:rPr>
-                <w:b/>
-              </w:rPr>
-            </w:pPr>
             <w:r>
-              <w:rPr>
-                <w:b/>
-              </w:rPr>
               <w:t>Test No.</w:t>
             </w:r>
           </w:p>
@@ -7916,17 +7884,7 @@
             <w:shd w:val="clear" w:color="auto" w:fill="auto"/>
           </w:tcPr>
           <w:p>
-            <w:pPr>
-              <w:ind w:firstLine="0"/>
-              <w:jc w:val="center"/>
-              <w:rPr>
-                <w:b/>
-              </w:rPr>
-            </w:pPr>
             <w:r>
-              <w:rPr>
-                <w:b/>
-              </w:rPr>
               <w:t>Input or action</w:t>
             </w:r>
           </w:p>
@@ -7937,17 +7895,7 @@
             <w:shd w:val="clear" w:color="auto" w:fill="auto"/>
           </w:tcPr>
           <w:p>
-            <w:pPr>
-              <w:ind w:firstLine="0"/>
-              <w:jc w:val="center"/>
-              <w:rPr>
-                <w:b/>
-              </w:rPr>
-            </w:pPr>
             <w:r>
-              <w:rPr>
-                <w:b/>
-              </w:rPr>
               <w:t>Expected result</w:t>
             </w:r>
           </w:p>
@@ -7958,17 +7906,7 @@
             <w:shd w:val="clear" w:color="auto" w:fill="auto"/>
           </w:tcPr>
           <w:p>
-            <w:pPr>
-              <w:ind w:firstLine="0"/>
-              <w:jc w:val="center"/>
-              <w:rPr>
-                <w:b/>
-              </w:rPr>
-            </w:pPr>
             <w:r>
-              <w:rPr>
-                <w:b/>
-              </w:rPr>
               <w:t>Actual result</w:t>
             </w:r>
           </w:p>
@@ -7979,17 +7917,7 @@
             <w:shd w:val="clear" w:color="auto" w:fill="auto"/>
           </w:tcPr>
           <w:p>
-            <w:pPr>
-              <w:ind w:firstLine="0"/>
-              <w:jc w:val="center"/>
-              <w:rPr>
-                <w:b/>
-              </w:rPr>
-            </w:pPr>
             <w:r>
-              <w:rPr>
-                <w:b/>
-              </w:rPr>
               <w:t>Conclusion</w:t>
             </w:r>
           </w:p>
@@ -8002,9 +7930,6 @@
             <w:shd w:val="clear" w:color="auto" w:fill="auto"/>
           </w:tcPr>
           <w:p>
-            <w:pPr>
-              <w:ind w:firstLine="0"/>
-            </w:pPr>
             <w:r>
               <w:t>1</w:t>
             </w:r>
@@ -8016,11 +7941,8 @@
             <w:shd w:val="clear" w:color="auto" w:fill="auto"/>
           </w:tcPr>
           <w:p>
-            <w:pPr>
-              <w:ind w:firstLine="0"/>
-            </w:pPr>
             <w:r>
-              <w:t>Open view data when shops.txt does not exist.</w:t>
+              <w:t>Run make test, which starts with a clean build.</w:t>
             </w:r>
           </w:p>
         </w:tc>
@@ -8030,11 +7952,8 @@
             <w:shd w:val="clear" w:color="auto" w:fill="auto"/>
           </w:tcPr>
           <w:p>
-            <w:pPr>
-              <w:ind w:firstLine="0"/>
-            </w:pPr>
             <w:r>
-              <w:t>The program reports that the file is empty or does not exist.</w:t>
+              <w:t>The program compiles without warnings or errors.</w:t>
             </w:r>
           </w:p>
         </w:tc>
@@ -8044,11 +7963,8 @@
             <w:shd w:val="clear" w:color="auto" w:fill="auto"/>
           </w:tcPr>
           <w:p>
-            <w:pPr>
-              <w:ind w:firstLine="0"/>
-            </w:pPr>
             <w:r>
-              <w:t>Message "File is empty or does not exist." is shown.</w:t>
+              <w:t>Build finished successfully.</w:t>
             </w:r>
           </w:p>
         </w:tc>
@@ -8058,9 +7974,6 @@
             <w:shd w:val="clear" w:color="auto" w:fill="auto"/>
           </w:tcPr>
           <w:p>
-            <w:pPr>
-              <w:ind w:firstLine="0"/>
-            </w:pPr>
             <w:r>
               <w:t>Pass</w:t>
             </w:r>
@@ -8074,9 +7987,6 @@
             <w:shd w:val="clear" w:color="auto" w:fill="auto"/>
           </w:tcPr>
           <w:p>
-            <w:pPr>
-              <w:ind w:firstLine="0"/>
-            </w:pPr>
             <w:r>
               <w:t>2</w:t>
             </w:r>
@@ -8088,11 +7998,8 @@
             <w:shd w:val="clear" w:color="auto" w:fill="auto"/>
           </w:tcPr>
           <w:p>
-            <w:pPr>
-              <w:ind w:firstLine="0"/>
-            </w:pPr>
             <w:r>
-              <w:t>Add two shops and choose view data.</w:t>
+              <w:t>Choose View data when shops.dat does not exist.</w:t>
             </w:r>
           </w:p>
         </w:tc>
@@ -8102,11 +8009,8 @@
             <w:shd w:val="clear" w:color="auto" w:fill="auto"/>
           </w:tcPr>
           <w:p>
-            <w:pPr>
-              <w:ind w:firstLine="0"/>
-            </w:pPr>
             <w:r>
-              <w:t>Both saved records are printed with count and all structure fields.</w:t>
+              <w:t>The program reports that the file is empty or does not exist.</w:t>
             </w:r>
           </w:p>
         </w:tc>
@@ -8116,11 +8020,8 @@
             <w:shd w:val="clear" w:color="auto" w:fill="auto"/>
           </w:tcPr>
           <w:p>
-            <w:pPr>
-              <w:ind w:firstLine="0"/>
-            </w:pPr>
             <w:r>
-              <w:t>The program prints count 2 and both shop records correctly.</w:t>
+              <w:t>Message "File is empty or does not exist." is shown.</w:t>
             </w:r>
           </w:p>
         </w:tc>
@@ -8130,9 +8031,6 @@
             <w:shd w:val="clear" w:color="auto" w:fill="auto"/>
           </w:tcPr>
           <w:p>
-            <w:pPr>
-              <w:ind w:firstLine="0"/>
-            </w:pPr>
             <w:r>
               <w:t>Pass</w:t>
             </w:r>
@@ -8146,9 +8044,6 @@
             <w:shd w:val="clear" w:color="auto" w:fill="auto"/>
           </w:tcPr>
           <w:p>
-            <w:pPr>
-              <w:ind w:firstLine="0"/>
-            </w:pPr>
             <w:r>
               <w:t>3</w:t>
             </w:r>
@@ -8160,11 +8055,8 @@
             <w:shd w:val="clear" w:color="auto" w:fill="auto"/>
           </w:tcPr>
           <w:p>
-            <w:pPr>
-              <w:ind w:firstLine="0"/>
-            </w:pPr>
             <w:r>
-              <w:t>Search address Maskavas 5 after records are added.</w:t>
+              <w:t>Add a shop with title, address, and telephone number.</w:t>
             </w:r>
           </w:p>
         </w:tc>
@@ -8174,11 +8066,8 @@
             <w:shd w:val="clear" w:color="auto" w:fill="auto"/>
           </w:tcPr>
           <w:p>
-            <w:pPr>
-              <w:ind w:firstLine="0"/>
-            </w:pPr>
             <w:r>
-              <w:t>Telephone number +371222222 is found and printed.</w:t>
+              <w:t>The record is saved to the binary file shops.dat.</w:t>
             </w:r>
           </w:p>
         </w:tc>
@@ -8188,11 +8077,8 @@
             <w:shd w:val="clear" w:color="auto" w:fill="auto"/>
           </w:tcPr>
           <w:p>
-            <w:pPr>
-              <w:ind w:firstLine="0"/>
-            </w:pPr>
             <w:r>
-              <w:t>The program prints "Tel. number: +371222222".</w:t>
+              <w:t>Message "Data saved." is shown.</w:t>
             </w:r>
           </w:p>
         </w:tc>
@@ -8202,9 +8088,6 @@
             <w:shd w:val="clear" w:color="auto" w:fill="auto"/>
           </w:tcPr>
           <w:p>
-            <w:pPr>
-              <w:ind w:firstLine="0"/>
-            </w:pPr>
             <w:r>
               <w:t>Pass</w:t>
             </w:r>
@@ -8218,9 +8101,6 @@
             <w:shd w:val="clear" w:color="auto" w:fill="auto"/>
           </w:tcPr>
           <w:p>
-            <w:pPr>
-              <w:ind w:firstLine="0"/>
-            </w:pPr>
             <w:r>
               <w:t>4</w:t>
             </w:r>
@@ -8232,11 +8112,8 @@
             <w:shd w:val="clear" w:color="auto" w:fill="auto"/>
           </w:tcPr>
           <w:p>
-            <w:pPr>
-              <w:ind w:firstLine="0"/>
-            </w:pPr>
             <w:r>
-              <w:t>Search address that is not stored in the file.</w:t>
+              <w:t>Choose View data after adding a shop.</w:t>
             </w:r>
           </w:p>
         </w:tc>
@@ -8246,11 +8123,8 @@
             <w:shd w:val="clear" w:color="auto" w:fill="auto"/>
           </w:tcPr>
           <w:p>
-            <w:pPr>
-              <w:ind w:firstLine="0"/>
-            </w:pPr>
             <w:r>
-              <w:t>A not found message is printed.</w:t>
+              <w:t>The saved record is printed with all structure fields.</w:t>
             </w:r>
           </w:p>
         </w:tc>
@@ -8260,11 +8134,8 @@
             <w:shd w:val="clear" w:color="auto" w:fill="auto"/>
           </w:tcPr>
           <w:p>
-            <w:pPr>
-              <w:ind w:firstLine="0"/>
-            </w:pPr>
             <w:r>
-              <w:t>The program prints "Shop with this address was not found.".</w:t>
+              <w:t>The program prints the saved shop title, address, and tel. number.</w:t>
             </w:r>
           </w:p>
         </w:tc>
@@ -8274,9 +8145,6 @@
             <w:shd w:val="clear" w:color="auto" w:fill="auto"/>
           </w:tcPr>
           <w:p>
-            <w:pPr>
-              <w:ind w:firstLine="0"/>
-            </w:pPr>
             <w:r>
               <w:t>Pass</w:t>
             </w:r>
@@ -8290,9 +8158,6 @@
             <w:shd w:val="clear" w:color="auto" w:fill="auto"/>
           </w:tcPr>
           <w:p>
-            <w:pPr>
-              <w:ind w:firstLine="0"/>
-            </w:pPr>
             <w:r>
               <w:t>5</w:t>
             </w:r>
@@ -8304,11 +8169,8 @@
             <w:shd w:val="clear" w:color="auto" w:fill="auto"/>
           </w:tcPr>
           <w:p>
-            <w:pPr>
-              <w:ind w:firstLine="0"/>
-            </w:pPr>
             <w:r>
-              <w:t>Enter a non-numeric menu value.</w:t>
+              <w:t>Search for an address that exists in shops.dat.</w:t>
             </w:r>
           </w:p>
         </w:tc>
@@ -8318,11 +8180,8 @@
             <w:shd w:val="clear" w:color="auto" w:fill="auto"/>
           </w:tcPr>
           <w:p>
-            <w:pPr>
-              <w:ind w:firstLine="0"/>
-            </w:pPr>
             <w:r>
-              <w:t>The program rejects the value and asks again.</w:t>
+              <w:t>The telephone number for that shop is found and printed.</w:t>
             </w:r>
           </w:p>
         </w:tc>
@@ -8332,11 +8191,8 @@
             <w:shd w:val="clear" w:color="auto" w:fill="auto"/>
           </w:tcPr>
           <w:p>
-            <w:pPr>
-              <w:ind w:firstLine="0"/>
-            </w:pPr>
             <w:r>
-              <w:t>The program prints "Invalid menu item." and continues.</w:t>
+              <w:t>The program prints the expected tel. number.</w:t>
             </w:r>
           </w:p>
         </w:tc>
@@ -8346,9 +8202,266 @@
             <w:shd w:val="clear" w:color="auto" w:fill="auto"/>
           </w:tcPr>
           <w:p>
-            <w:pPr>
-              <w:ind w:firstLine="0"/>
-            </w:pPr>
+            <w:r>
+              <w:t>Pass</w:t>
+            </w:r>
+          </w:p>
+        </w:tc>
+      </w:tr>
+      <w:tr>
+        <w:tc>
+          <w:tcPr>
+            <w:tcW w:type="dxa" w:w="1937"/>
+          </w:tcPr>
+          <w:p>
+            <w:r>
+              <w:t>6</w:t>
+            </w:r>
+          </w:p>
+        </w:tc>
+        <w:tc>
+          <w:tcPr>
+            <w:tcW w:type="dxa" w:w="1938"/>
+          </w:tcPr>
+          <w:p>
+            <w:r>
+              <w:t>Search for an address that is not stored in the file.</w:t>
+            </w:r>
+          </w:p>
+        </w:tc>
+        <w:tc>
+          <w:tcPr>
+            <w:tcW w:type="dxa" w:w="1938"/>
+          </w:tcPr>
+          <w:p>
+            <w:r>
+              <w:t>A not found message is printed.</w:t>
+            </w:r>
+          </w:p>
+        </w:tc>
+        <w:tc>
+          <w:tcPr>
+            <w:tcW w:type="dxa" w:w="1938"/>
+          </w:tcPr>
+          <w:p>
+            <w:r>
+              <w:t>The program prints "Shop with this address was not found."</w:t>
+            </w:r>
+          </w:p>
+        </w:tc>
+        <w:tc>
+          <w:tcPr>
+            <w:tcW w:type="dxa" w:w="1938"/>
+          </w:tcPr>
+          <w:p>
+            <w:r>
+              <w:t>Pass</w:t>
+            </w:r>
+          </w:p>
+        </w:tc>
+      </w:tr>
+      <w:tr>
+        <w:tc>
+          <w:tcPr>
+            <w:tcW w:type="dxa" w:w="1937"/>
+          </w:tcPr>
+          <w:p>
+            <w:r>
+              <w:t>7</w:t>
+            </w:r>
+          </w:p>
+        </w:tc>
+        <w:tc>
+          <w:tcPr>
+            <w:tcW w:type="dxa" w:w="1938"/>
+          </w:tcPr>
+          <w:p>
+            <w:r>
+              <w:t>Add two shops and choose View data.</w:t>
+            </w:r>
+          </w:p>
+        </w:tc>
+        <w:tc>
+          <w:tcPr>
+            <w:tcW w:type="dxa" w:w="1938"/>
+          </w:tcPr>
+          <w:p>
+            <w:r>
+              <w:t>Both saved records are printed and the count is 2.</w:t>
+            </w:r>
+          </w:p>
+        </w:tc>
+        <w:tc>
+          <w:tcPr>
+            <w:tcW w:type="dxa" w:w="1938"/>
+          </w:tcPr>
+          <w:p>
+            <w:r>
+              <w:t>The program prints "Shops in file: 2" and both records.</w:t>
+            </w:r>
+          </w:p>
+        </w:tc>
+        <w:tc>
+          <w:tcPr>
+            <w:tcW w:type="dxa" w:w="1938"/>
+          </w:tcPr>
+          <w:p>
+            <w:r>
+              <w:t>Pass</w:t>
+            </w:r>
+          </w:p>
+        </w:tc>
+      </w:tr>
+      <w:tr>
+        <w:tc>
+          <w:tcPr>
+            <w:tcW w:type="dxa" w:w="1937"/>
+          </w:tcPr>
+          <w:p>
+            <w:r>
+              <w:t>8</w:t>
+            </w:r>
+          </w:p>
+        </w:tc>
+        <w:tc>
+          <w:tcPr>
+            <w:tcW w:type="dxa" w:w="1938"/>
+          </w:tcPr>
+          <w:p>
+            <w:r>
+              <w:t>Add data containing spaces and special characters, including |.</w:t>
+            </w:r>
+          </w:p>
+        </w:tc>
+        <w:tc>
+          <w:tcPr>
+            <w:tcW w:type="dxa" w:w="1938"/>
+          </w:tcPr>
+          <w:p>
+            <w:r>
+              <w:t>The binary file stores and displays the characters without delimiter problems.</w:t>
+            </w:r>
+          </w:p>
+        </w:tc>
+        <w:tc>
+          <w:tcPr>
+            <w:tcW w:type="dxa" w:w="1938"/>
+          </w:tcPr>
+          <w:p>
+            <w:r>
+              <w:t>The entered data are displayed correctly.</w:t>
+            </w:r>
+          </w:p>
+        </w:tc>
+        <w:tc>
+          <w:tcPr>
+            <w:tcW w:type="dxa" w:w="1938"/>
+          </w:tcPr>
+          <w:p>
+            <w:r>
+              <w:t>Pass</w:t>
+            </w:r>
+          </w:p>
+        </w:tc>
+      </w:tr>
+      <w:tr>
+        <w:tc>
+          <w:tcPr>
+            <w:tcW w:type="dxa" w:w="1937"/>
+          </w:tcPr>
+          <w:p>
+            <w:r>
+              <w:t>9</w:t>
+            </w:r>
+          </w:p>
+        </w:tc>
+        <w:tc>
+          <w:tcPr>
+            <w:tcW w:type="dxa" w:w="1938"/>
+          </w:tcPr>
+          <w:p>
+            <w:r>
+              <w:t>Enter invalid menu values: 99, abc, and -1.</w:t>
+            </w:r>
+          </w:p>
+        </w:tc>
+        <w:tc>
+          <w:tcPr>
+            <w:tcW w:type="dxa" w:w="1938"/>
+          </w:tcPr>
+          <w:p>
+            <w:r>
+              <w:t>The program rejects each invalid value and continues.</w:t>
+            </w:r>
+          </w:p>
+        </w:tc>
+        <w:tc>
+          <w:tcPr>
+            <w:tcW w:type="dxa" w:w="1938"/>
+          </w:tcPr>
+          <w:p>
+            <w:r>
+              <w:t>The program prints "Invalid menu item."</w:t>
+            </w:r>
+          </w:p>
+        </w:tc>
+        <w:tc>
+          <w:tcPr>
+            <w:tcW w:type="dxa" w:w="1938"/>
+          </w:tcPr>
+          <w:p>
+            <w:r>
+              <w:t>Pass</w:t>
+            </w:r>
+          </w:p>
+        </w:tc>
+      </w:tr>
+      <w:tr>
+        <w:tc>
+          <w:tcPr>
+            <w:tcW w:type="dxa" w:w="1937"/>
+          </w:tcPr>
+          <w:p>
+            <w:r>
+              <w:t>10</w:t>
+            </w:r>
+          </w:p>
+        </w:tc>
+        <w:tc>
+          <w:tcPr>
+            <w:tcW w:type="dxa" w:w="1938"/>
+          </w:tcPr>
+          <w:p>
+            <w:r>
+              <w:t>Choose Exit.</w:t>
+            </w:r>
+          </w:p>
+        </w:tc>
+        <w:tc>
+          <w:tcPr>
+            <w:tcW w:type="dxa" w:w="1938"/>
+          </w:tcPr>
+          <w:p>
+            <w:r>
+              <w:t>The program terminates normally.</w:t>
+            </w:r>
+          </w:p>
+        </w:tc>
+        <w:tc>
+          <w:tcPr>
+            <w:tcW w:type="dxa" w:w="1938"/>
+          </w:tcPr>
+          <w:p>
+            <w:r>
+              <w:t>The program exits with status 0.</w:t>
+            </w:r>
+          </w:p>
+        </w:tc>
+        <w:tc>
+          <w:tcPr>
+            <w:tcW w:type="dxa" w:w="1938"/>
+          </w:tcPr>
+          <w:p>
             <w:r>
               <w:t>Pass</w:t>
             </w:r>

</xml_diff>